<commit_message>
Inclui o gerador do .docx da RISTI e os logs de execucao
build_risti.js e artigo_risti_pt.docx refletem uma versao anterior do
texto (ainda sem autoria, sem o titulo e a conclusao atuais) e precisam
ser sincronizados com paper_pt.tex. Os logs registram as execucoes do
pipeline completo e da sensibilidade.

Co-Authored-By: Claude Sonnet 5.5 <noreply@anthropic.com>
</commit_message>
<xml_diff>
--- a/artigo_risti_pt.docx
+++ b/artigo_risti_pt.docx
@@ -85,7 +85,7 @@
           <w:sz w:val="18"/>
           <w:szCs w:val="18"/>
         </w:rPr>
-        <w:t xml:space="preserve">Este estudo exploratório modela as redes viárias de três bairros do Rio de Janeiro como grafos dirigidos e ponderados a partir do OpenStreetMap, perguntando se a estrutura dirigida revela um gargalo de acesso que a análise não dirigida deixa passar, e se isso reflete geografia, não tamanho. Comparamos uma península compacta (Urca) com duas grandes malhas abertas de orla (Copacabana e Botafogo), usando conectividade, caminhos mínimos, centralidade de intermediação e fluxo máximo. Os indicadores estruturais separam as duas malhas da Urca mas, corrigido um erro de recorte que atribuía parte de Botafogo à Copacabana, deixam de se parecer entre si. O corte mínimo entre dois nós satura em um em toda parte; um fluxo máximo até as portas de acesso administrativas reais de cada bairro, por sua vez, ordena os casos: uma porta para a Urca, dezoito para Copacabana, dezesseis para Botafogo. O gargalo é específico da geografia da península, não do tamanho, e não se generaliza para bairros grandes. Código e dados são abertos.</w:t>
+        <w:t xml:space="preserve">Este estudo exploratório modela as redes viárias de três bairros do Rio de Janeiro como grafos dirigidos e ponderados a partir do OpenStreetMap, perguntando se a estrutura dirigida revela um gargalo de acesso que a análise não dirigida deixa passar, e se isso reflete geografia, não tamanho. Comparamos uma península compacta (Urca) com duas grandes malhas abertas de orla (Copacabana e Botafogo), com as três redes recortadas pelo mesmo polígono administrativo oficial, usando conectividade, caminhos mínimos, centralidade de intermediação e fluxo máximo. Os indicadores estruturais dirigidos (pontes e articulações fortes) não ordenam os casos ao longo de um eixo de gargalo: a Urca fica entre as duas malhas em pontes fortes, e estas diferem bastante entre si. O corte mínimo entre dois nós satura em um em toda parte; um fluxo máximo até as portas de acesso administrativas reais de cada bairro, por sua vez, ordena os casos: uma rota disjunta para a Urca, dezoito para Copacabana, quinze para Botafogo, ordem que se mantém com o recorte por retângulo e sob variações da margem de fronteira. O gargalo é específico da geografia da península, não do tamanho, e não se generaliza para bairros grandes. Código e dados são abertos.</w:t>
       </w:r>
     </w:p>
     <w:p>
@@ -149,7 +149,7 @@
           <w:sz w:val="18"/>
           <w:szCs w:val="18"/>
         </w:rPr>
-        <w:t xml:space="preserve">This exploratory study models the street networks of three Rio de Janeiro neighbourhoods as directed, weighted graphs from OpenStreetMap, asking whether directed structure reveals an access bottleneck that undirected analysis misses, and whether it reflects geography rather than size. We compare a compact peninsula (Urca) with two large, open beachfront grids (Copacabana and Botafogo), using connectivity, shortest paths, betweenness centrality, and maximum flow. Structural indicators separate both grids from Urca but, once a bounding-box error that misattributed part of Botafogo to Copacabana is corrected, no longer resemble each other closely. Node-to-node minimum cut saturates at one everywhere; a maximum flow from each core to its real administrative gateways instead orders the cases: one gateway for Urca, eighteen for Copacabana, sixteen for Botafogo. The bottleneck is specific to the peninsula's geography, not its size, and does not generalise to large neighbourhoods. Code and data are open.</w:t>
+        <w:t xml:space="preserve">This exploratory study models the street networks of three Rio de Janeiro neighbourhoods as directed, weighted graphs from OpenStreetMap, asking whether directed structure reveals an access bottleneck that undirected analysis misses, and whether it reflects geography rather than size. We compare a compact peninsula (Urca) with two large, open beachfront grids (Copacabana and Botafogo), with all three networks clipped to the same official administrative polygon, using connectivity, shortest paths, betweenness centrality, and maximum flow. The directed structural indicators (strong bridges and articulation points) do not order the cases along a bottleneck axis: Urca falls between the two grids on strong bridges, and the grids differ considerably from each other. Node-to-node minimum cut saturates at one everywhere; a maximum flow from each core to its real administrative gateways instead orders the cases: one street-disjoint route for Urca, eighteen for Copacabana, fifteen for Botafogo, an ordering that holds under a bounding-box clip and under variations of the boundary margin. The bottleneck is specific to the peninsula's geography, not its size, and does not generalise to large neighbourhoods. Code and data are open.</w:t>
       </w:r>
     </w:p>
     <w:p>
@@ -301,7 +301,7 @@
           <w:sz w:val="20"/>
           <w:szCs w:val="20"/>
         </w:rPr>
-        <w:t xml:space="preserve">Essa distinção não é apenas teórica para redes viárias, nas quais a regulamentação de mão única é predominante (75-93% dos trechos em nossos casos). Ferramentas como o OSMnx (Boeing, 2017) constroem grafos viários dirigidos, mas estudos de conectividade e resiliência costumam reduzi-los ao grafo não dirigido ou a resumos topológicos agregados (Corcoran &amp; Jones, 2021), confundindo “alcançável” com “alcançável e capaz de retornar” e ocultando o efeito da direção. Aplicamos as noções fortes a bairros reais, apresentamos lado a lado os retratos fraco (não dirigido) e forte, e quantificamos o quanto o núcleo fortemente conexo se reduz sob a direção, uma lacuna que a análise não dirigida não é capaz de enxergar. Privilegiamos a transparência em detrimento da complexidade assintótica: em vez do algoritmo de tempo linear de Italiano, recalculamos as componentes fortes após a remoção de cada elemento candidato, restritas ao núcleo forte gigante, o que roda em segundos nessa escala (dezenas a algumas centenas de interseções), uma escolha de simplicidade, não uma alegação de escalabilidade.</w:t>
+        <w:t xml:space="preserve">Essa distinção não é apenas teórica para redes viárias, nas quais a regulamentação de mão única é predominante (74-91% dos trechos em nossos casos). Ferramentas como o OSMnx (Boeing, 2017) constroem grafos viários dirigidos, mas estudos de conectividade e resiliência costumam reduzi-los ao grafo não dirigido ou a resumos topológicos agregados (Corcoran &amp; Jones, 2021), confundindo “alcançável” com “alcançável e capaz de retornar” e ocultando o efeito da direção. Aplicamos as noções fortes a bairros reais, apresentamos lado a lado os retratos fraco (não dirigido) e forte, e quantificamos o quanto o núcleo fortemente conexo se reduz sob a direção, uma lacuna que a análise não dirigida não é capaz de enxergar. Privilegiamos a transparência em detrimento da complexidade assintótica: em vez do algoritmo de tempo linear de Italiano, recalculamos as componentes fortes após a remoção de cada elemento candidato, restritas ao núcleo forte gigante, o que roda em segundos nessa escala (dezenas a algumas centenas de interseções), uma escolha de simplicidade, não uma alegação de escalabilidade.</w:t>
       </w:r>
     </w:p>
     <w:p>
@@ -585,7 +585,21 @@
           <w:sz w:val="20"/>
           <w:szCs w:val="20"/>
         </w:rPr>
-        <w:t xml:space="preserve">Um retângulo delimitador traçado manualmente é uma escolha de modelagem, e constatamos que essa escolha tem consequências. O retângulo de Copacabana foi originalmente traçado para manter seus dois túneis rodoviários como arestas internas, estendendo-se para o norte, além da fronteira administrativa com Botafogo. A conferência de cada interseção em relação ao polígono oficial do bairro (Instituto Pereira Passos [IPP], 2024) mostrou que 158 de suas 496 interseções, e 155 de seus trechos de rua, situavam-se, na verdade, dentro do território de Botafogo: as duas redes publicadas compartilhavam 143 interseções idênticas do OpenStreetMap. Por isso, passamos a usar o retângulo manual apenas como envelope de busca, unido ao retângulo delimitador do próprio polígono oficial para garantir cobertura total, e recortamos o grafo resultante pelo polígono oficial antes de qualquer análise. Urca e Botafogo não precisaram dessa correção: no máximo quatro de suas interseções ficam fora do próprio polígono, e nenhum de seus números publicados se altera. Toda figura e tabela referentes a Copacabana neste artigo refletem a rede corrigida e recortada pelo polígono, com 345 interseções (Tabela 1), e não as 496 originais.</w:t>
+        <w:t xml:space="preserve">Um retângulo delimitador traçado manualmente é uma escolha de modelagem, e constatamos que essa escolha tem consequências, que diferem de bairro para bairro. O retângulo de Copacabana foi originalmente traçado para manter seus dois túneis rodoviários como arestas internas, estendendo-se para o norte, além da fronteira administrativa com Botafogo. A conferência de cada interseção em relação ao polígono oficial do bairro (Instituto Pereira Passos [IPP], 2024) mostrou que 158 de suas 496 interseções, e 155 de seus trechos de rua, situavam-se, na verdade, dentro do território de Botafogo: as duas redes compartilhavam 143 interseções idênticas do OpenStreetMap. Em Urca e Botafogo ocorre o inverso: o polígono oficial é maior que o retângulo manual, e este truncava a rede em sua borda.</w:t>
+      </w:r>
+    </w:p>
+    <w:p>
+      <w:pPr>
+        <w:spacing w:after="120"/>
+        <w:jc w:val="both"/>
+      </w:pPr>
+      <w:r>
+        <w:rPr>
+          <w:rFonts w:ascii="Georgia" w:cs="Georgia" w:eastAsia="Georgia" w:hAnsi="Georgia"/>
+          <w:sz w:val="20"/>
+          <w:szCs w:val="20"/>
+        </w:rPr>
+        <w:t xml:space="preserve">Para que nenhuma diferença entre os bairros decorra de um pré-processamento desigual, aplicamos a mesma regra aos três: o retângulo manual é usado apenas como envelope de busca, unido ao retângulo delimitador do próprio polígono oficial para garantir cobertura total, e o grafo resultante é recortado pelo polígono oficial antes de qualquer análise. A mesma fronteira define as portas de acesso (Seção 3.3). Todas as figuras e tabelas deste artigo refletem essas redes (Tabela 1); a Seção 4.6 compara o resultado com o retângulo manual sem recorte.</w:t>
       </w:r>
     </w:p>
     <w:p>
@@ -601,7 +615,7 @@
           <w:sz w:val="18"/>
           <w:szCs w:val="18"/>
         </w:rPr>
-        <w:t xml:space="preserve">Tabela 1 - Redes após a simplificação topológica (OpenStreetMap); Copacabana está recortada pelo seu polígono administrativo oficial</w:t>
+        <w:t xml:space="preserve">Tabela 1 - Redes após a simplificação topológica (OpenStreetMap), as três recortadas pelo polígono administrativo oficial do bairro</w:t>
       </w:r>
     </w:p>
     <w:tbl>
@@ -741,7 +755,7 @@
                 <w:sz w:val="18"/>
                 <w:szCs w:val="18"/>
               </w:rPr>
-              <w:t xml:space="preserve">60</w:t>
+              <w:t xml:space="preserve">70</w:t>
             </w:r>
           </w:p>
         </w:tc>
@@ -777,7 +791,7 @@
                 <w:sz w:val="18"/>
                 <w:szCs w:val="18"/>
               </w:rPr>
-              <w:t xml:space="preserve">398</w:t>
+              <w:t xml:space="preserve">434</w:t>
             </w:r>
           </w:p>
         </w:tc>
@@ -815,7 +829,7 @@
                 <w:sz w:val="18"/>
                 <w:szCs w:val="18"/>
               </w:rPr>
-              <w:t xml:space="preserve">89</w:t>
+              <w:t xml:space="preserve">104</w:t>
             </w:r>
           </w:p>
         </w:tc>
@@ -851,7 +865,7 @@
                 <w:sz w:val="18"/>
                 <w:szCs w:val="18"/>
               </w:rPr>
-              <w:t xml:space="preserve">500</w:t>
+              <w:t xml:space="preserve">563</w:t>
             </w:r>
           </w:p>
         </w:tc>
@@ -889,7 +903,7 @@
                 <w:sz w:val="18"/>
                 <w:szCs w:val="18"/>
               </w:rPr>
-              <w:t xml:space="preserve">93,3</w:t>
+              <w:t xml:space="preserve">91,3</w:t>
             </w:r>
           </w:p>
         </w:tc>
@@ -925,7 +939,7 @@
                 <w:sz w:val="18"/>
                 <w:szCs w:val="18"/>
               </w:rPr>
-              <w:t xml:space="preserve">76,4</w:t>
+              <w:t xml:space="preserve">76,2</w:t>
             </w:r>
           </w:p>
         </w:tc>
@@ -963,7 +977,7 @@
                 <w:sz w:val="18"/>
                 <w:szCs w:val="18"/>
               </w:rPr>
-              <w:t xml:space="preserve">37</w:t>
+              <w:t xml:space="preserve">65</w:t>
             </w:r>
           </w:p>
         </w:tc>
@@ -999,7 +1013,7 @@
                 <w:sz w:val="18"/>
                 <w:szCs w:val="18"/>
               </w:rPr>
-              <w:t xml:space="preserve">341</w:t>
+              <w:t xml:space="preserve">392</w:t>
             </w:r>
           </w:p>
         </w:tc>
@@ -1037,7 +1051,7 @@
                 <w:sz w:val="18"/>
                 <w:szCs w:val="18"/>
               </w:rPr>
-              <w:t xml:space="preserve">38,3</w:t>
+              <w:t xml:space="preserve">7,1</w:t>
             </w:r>
           </w:p>
         </w:tc>
@@ -1073,7 +1087,7 @@
                 <w:sz w:val="18"/>
                 <w:szCs w:val="18"/>
               </w:rPr>
-              <w:t xml:space="preserve">14,3</w:t>
+              <w:t xml:space="preserve">9,7</w:t>
             </w:r>
           </w:p>
         </w:tc>
@@ -1095,7 +1109,7 @@
           <w:sz w:val="20"/>
           <w:szCs w:val="20"/>
         </w:rPr>
-        <w:t xml:space="preserve">A Figura 2 mostra as três redes após a simplificação, distinguindo trechos de mão única e de mão dupla. As duas malhas residenciais da Urca, unidas por um único corredor de mão dupla, ficam visíveis em contraste com as grandes malhas abertas de Copacabana e Botafogo; esse corredor é a constrição de acesso analisada na Seção 4.</w:t>
+        <w:t xml:space="preserve">A Figura 2 mostra as três redes após a simplificação, distinguindo trechos de mão única e de mão dupla. As duas malhas residenciais da Urca, unidas por um único corredor, ficam visíveis em contraste com as grandes malhas abertas de Copacabana e Botafogo; esse corredor é a constrição de acesso analisada na Seção 4.</w:t>
       </w:r>
     </w:p>
     <w:p>
@@ -1106,7 +1120,7 @@
       <w:r>
         <w:drawing>
           <wp:inline distT="0" distB="0" distL="0" distR="0">
-            <wp:extent cx="4381500" cy="1581150"/>
+            <wp:extent cx="4381500" cy="1600200"/>
             <wp:effectExtent t="0" r="0" b="0" l="0"/>
             <wp:docPr id="1" name="" descr="" title=""/>
             <wp:cNvGraphicFramePr>
@@ -1131,7 +1145,7 @@
                   <pic:spPr bwMode="auto">
                     <a:xfrm>
                       <a:off x="0" y="0"/>
-                      <a:ext cx="4381500" cy="1581150"/>
+                      <a:ext cx="4381500" cy="1600200"/>
                     </a:xfrm>
                     <a:prstGeom prst="rect">
                       <a:avLst/>
@@ -1155,7 +1169,7 @@
           <w:sz w:val="18"/>
           <w:szCs w:val="18"/>
         </w:rPr>
-        <w:t xml:space="preserve">Figura 2 - As três redes dos bairros após a simplificação topológica (mão única em escuro, mão dupla em laranja). A Urca é uma península compacta cujas duas malhas se encontram em um único corredor de mão dupla; Copacabana e Botafogo são grandes malhas abertas. O painel de Copacabana reflete a rede corrigida e recortada pelo polígono.</w:t>
+        <w:t xml:space="preserve">Figura 2 - As três redes dos bairros após a simplificação topológica e o recorte pelo polígono oficial (mão única em escuro, mão dupla em laranja). A Urca é uma península compacta cujas duas malhas se encontram em um único corredor; Copacabana e Botafogo são grandes malhas abertas.</w:t>
       </w:r>
     </w:p>
     <w:p>
@@ -1281,7 +1295,7 @@
           <w:sz w:val="20"/>
           <w:szCs w:val="20"/>
         </w:rPr>
-        <w:t xml:space="preserve">). Cada rede viária é extraída com uma pequena margem além da própria fronteira do bairro (seu polígono oficial, no caso de Copacabana; seu retângulo delimitador de busca, no caso de Urca e Botafogo), suficiente para incluir a primeira interseção além da fronteira em toda rua que a cruze. Um vértice é uma porta de acesso se pelo menos uma de suas arestas incidentes cruza essa fronteira; todo outro vértice é interior. O conjunto de portas de acesso é, portanto, o conjunto de pontos pelos quais é fisicamente possível deixar o bairro, e não um marco interno escolhido por uma heurística de distância. Como uma porta de acesso pode admitir tráfego em apenas um sentido, restringimos o interior e o conjunto de portas de acesso ao maior componente não dirigido do bairro, e não ao seu núcleo fortemente conexo: uma saída de mão única ainda é uma saída real.</w:t>
+        <w:t xml:space="preserve">). Cada rede viária é extraída com uma pequena margem além da própria fronteira do bairro (seu polígono oficial, nos três casos), suficiente para incluir a primeira interseção além da fronteira em toda rua que a cruze. Um vértice é uma porta de acesso se pelo menos uma de suas arestas incidentes cruza essa fronteira; todo outro vértice é interior. O conjunto de portas de acesso é, portanto, o conjunto de pontos pelos quais é fisicamente possível deixar o bairro, e não um marco interno escolhido por uma heurística de distância. Como uma porta de acesso pode admitir tráfego em apenas um sentido, restringimos o interior e o conjunto de portas de acesso ao maior componente não dirigido do bairro, e não ao seu núcleo fortemente conexo: uma saída de mão única ainda é uma saída real.</w:t>
       </w:r>
     </w:p>
     <w:p>
@@ -1295,7 +1309,7 @@
           <w:sz w:val="20"/>
           <w:szCs w:val="20"/>
         </w:rPr>
-        <w:t xml:space="preserve">A região de origem é a fração f (f = 0,2) das interseções interiores mais distantes, em número de arestas, da porta de acesso mais próxima, ou seja, o núcleo do bairro. Uma superfonte alimenta a região de origem, e o conjunto completo de portas de acesso alimenta um superssumidouro, ambos com capacidade infinita, e o algoritmo de Edmonds-Karp é executado entre eles sobre a rede de capacidade unitária. O valor resultante, que chamamos de fluxo de acesso, é o número de rotas disjuntas por ruas entre o núcleo do bairro e suas saídas reais para o restante da cidade (Seção 4.3); esse valor é estável para f entre 0,15 e 0,25 nos três bairros e, no caso da Urca, para uma margem de busca de fronteira entre 200 e 800 m.</w:t>
+        <w:t xml:space="preserve">A região de origem é a fração f (f = 0,2) das interseções interiores mais distantes, em número de arestas, da porta de acesso mais próxima, ou seja, o núcleo do bairro. Uma superfonte alimenta a região de origem, e o conjunto completo de portas de acesso alimenta um superssumidouro, ambos com capacidade infinita, e o algoritmo de Edmonds-Karp é executado entre eles sobre a rede de capacidade unitária. O valor resultante, que chamamos de fluxo de acesso, é o número de rotas disjuntas por ruas entre o núcleo do bairro e suas saídas reais para o restante da cidade (Seção 4.3); esse valor é estável para f entre 0,15 e 0,25 e para uma margem de busca de fronteira entre 200 e 800 m, nos três bairros.</w:t>
       </w:r>
     </w:p>
     <w:p>
@@ -1353,7 +1367,7 @@
           <w:sz w:val="20"/>
           <w:szCs w:val="20"/>
         </w:rPr>
-        <w:t xml:space="preserve">A Tabela 2 apresenta os indicadores estruturais dirigidos como proporções, já que as contagens brutas não são comparáveis entre redes de tamanhos tão diferentes. As duas malhas grandes permanecem distantes do regime da Urca, mas deixam de se acompanhar de perto uma vez que Copacabana é corrigida para sua fronteira oficial (Seção 3.1): Botafogo tem consideravelmente mais pontes fortes (70,4% de suas ruas do núcleo) e articulações fortes (63,9%) do que Copacabana (45,3% e 54,1%). A Urca também não se destaca de forma decisiva nessas proporções (67,3% de pontes fortes, 75,7% de articulações fortes). A Figura 3 mostra, para a Urca, que os elementos fortes se concentram dentro da malha residencial, e não em um único ponto de acesso. As proporções, portanto, separam a Urca das duas malhas abertas, mas não separam as duas malhas abertas entre si, um contraste desenvolvido na Seção 5.</w:t>
+        <w:t xml:space="preserve">A Tabela 2 apresenta os indicadores estruturais dirigidos como proporções, já que as contagens brutas não são comparáveis entre redes de tamanhos tão diferentes. Eles não formam um eixo de gargalo. A Urca tem a maior proporção de articulações fortes (73,8%), mas em pontes fortes (61,5%) fica entre Copacabana (45,3%) e Botafogo (68,4%), e tem a menor proporção de pontes fracas (10,6%, contra 15,8% e 20,2%). As duas malhas abertas, por sua vez, diferem bastante entre si: Botafogo tem consideravelmente mais pontes fortes e articulações fortes (68,4% e 63,5%) do que Copacabana (45,3% e 54,1%). Essa diferença persiste quando as três redes são construídas com o retângulo manual em vez do polígono (Seção 4.6), portanto não decorre do pré-processamento. A Figura 3 mostra, para a Urca, que os elementos fortes se distribuem por todo o núcleo (59 das 96 ruas do núcleo são pontes fortes), nas duas malhas residenciais e no corredor que as liga, e não em um único ponto de acesso. As proporções, portanto, não separam os casos ao longo de um eixo de gargalo, um contraste desenvolvido na Seção 5.</w:t>
       </w:r>
     </w:p>
     <w:p>
@@ -1369,7 +1383,7 @@
           <w:sz w:val="18"/>
           <w:szCs w:val="18"/>
         </w:rPr>
-        <w:t xml:space="preserve">Tabela 2 - Indicadores estruturais dirigidos (normalizados); os valores de Copacabana referem-se à rede corrigida e recortada pelo polígono</w:t>
+        <w:t xml:space="preserve">Tabela 2 - Indicadores estruturais dirigidos (normalizados), com as três redes recortadas pelo polígono oficial</w:t>
       </w:r>
     </w:p>
     <w:tbl>
@@ -1509,7 +1523,7 @@
                 <w:sz w:val="18"/>
                 <w:szCs w:val="18"/>
               </w:rPr>
-              <w:t xml:space="preserve">10,1</w:t>
+              <w:t xml:space="preserve">10,6</w:t>
             </w:r>
           </w:p>
         </w:tc>
@@ -1545,7 +1559,7 @@
                 <w:sz w:val="18"/>
                 <w:szCs w:val="18"/>
               </w:rPr>
-              <w:t xml:space="preserve">25,2</w:t>
+              <w:t xml:space="preserve">20,2</w:t>
             </w:r>
           </w:p>
         </w:tc>
@@ -1583,7 +1597,7 @@
                 <w:sz w:val="18"/>
                 <w:szCs w:val="18"/>
               </w:rPr>
-              <w:t xml:space="preserve">67,3</w:t>
+              <w:t xml:space="preserve">61,5</w:t>
             </w:r>
           </w:p>
         </w:tc>
@@ -1619,7 +1633,7 @@
                 <w:sz w:val="18"/>
                 <w:szCs w:val="18"/>
               </w:rPr>
-              <w:t xml:space="preserve">70,4</w:t>
+              <w:t xml:space="preserve">68,4</w:t>
             </w:r>
           </w:p>
         </w:tc>
@@ -1657,7 +1671,7 @@
                 <w:sz w:val="18"/>
                 <w:szCs w:val="18"/>
               </w:rPr>
-              <w:t xml:space="preserve">75,7</w:t>
+              <w:t xml:space="preserve">73,8</w:t>
             </w:r>
           </w:p>
         </w:tc>
@@ -1693,7 +1707,7 @@
                 <w:sz w:val="18"/>
                 <w:szCs w:val="18"/>
               </w:rPr>
-              <w:t xml:space="preserve">63,9</w:t>
+              <w:t xml:space="preserve">63,5</w:t>
             </w:r>
           </w:p>
         </w:tc>
@@ -1761,7 +1775,7 @@
           <w:sz w:val="18"/>
           <w:szCs w:val="18"/>
         </w:rPr>
-        <w:t xml:space="preserve">Figura 3 - Gargalos estruturais dirigidos na Urca: ruas cuja remoção fragmenta o núcleo fortemente conexo (pontes fortes) e interseções com a mesma propriedade (pontos de articulação fortes). Eles se situam majoritariamente dentro da malha residencial, e não em um único ponto de acesso.</w:t>
+        <w:t xml:space="preserve">Figura 3 - Gargalos estruturais dirigidos na Urca: ruas cuja remoção fragmenta o núcleo fortemente conexo (pontes fortes) e interseções com a mesma propriedade (pontos de articulação fortes). Eles se distribuem por todo o núcleo, nas duas malhas residenciais e no corredor que as liga, e não em um único ponto de acesso.</w:t>
       </w:r>
     </w:p>
     <w:p>
@@ -1819,7 +1833,7 @@
           <w:sz w:val="20"/>
           <w:szCs w:val="20"/>
         </w:rPr>
-        <w:t xml:space="preserve">O fluxo de acesso por portas da Seção 3.3 ordena os casos (Tabela 3). A Urca tem uma única rota disjunta por ruas entre seu núcleo e suas quatro portas de acesso reais ao restante da cidade, valor estável para f entre 0,15 e 0,25 e para uma margem de busca de fronteira entre 200 e 800 m. Copacabana oferece dezoito dessas rotas por meio de vinte e uma portas de acesso, estável na mesma faixa de f; Botafogo oferece de quinze a dezesseis por meio de vinte e oito, o único dos três valores com alguma sensibilidade a f, e ainda assim uma ordem de grandeza acima da Urca em toda a faixa. Esse é o único indicador que isola um gargalo de acesso, e ele não acompanha o tamanho: Botafogo (seis a oito vezes maior que a Urca) e a Copacabana, agora bem menor após a correção, oferecem ambos uma ordem de grandeza a mais de rotas do que a Urca. O acesso de Copacabana não se reduz a seus dois túneis: eles são apenas duas de suas vinte e uma portas de acesso, de modo que ruas de superfície sustentam a maior parte de suas dezoito rotas disjuntas.</w:t>
+        <w:t xml:space="preserve">O fluxo de acesso por portas da Seção 3.3 ordena os casos (Tabela 3). A Urca tem uma única rota disjunta por ruas entre seu núcleo e suas três portas de acesso reais ao restante da cidade. Copacabana oferece dezoito dessas rotas por meio de vinte e uma portas de acesso, e Botafogo, quinze por meio de trinta e uma. Os três valores são idênticos para f entre 0,15 e 0,25 e para uma margem de busca de fronteira entre 200 e 800 m, e as duas malhas abertas ficam uma ordem de grandeza acima da Urca em toda essa faixa. Esse é o único indicador que isola um gargalo de acesso, e ele não acompanha o tamanho: Botafogo (cerca de seis vezes maior que a Urca em interseções) e Copacabana (cerca de cinco vezes maior) oferecem ambos uma ordem de grandeza a mais de rotas do que a Urca. O acesso de Copacabana não se reduz a seus dois túneis: eles são apenas duas de suas vinte e uma portas de acesso, de modo que ruas de superfície sustentam a maior parte de suas dezoito rotas disjuntas.</w:t>
       </w:r>
     </w:p>
     <w:p>
@@ -1975,7 +1989,7 @@
                 <w:sz w:val="18"/>
                 <w:szCs w:val="18"/>
               </w:rPr>
-              <w:t xml:space="preserve">4</w:t>
+              <w:t xml:space="preserve">3</w:t>
             </w:r>
           </w:p>
         </w:tc>
@@ -2011,7 +2025,7 @@
                 <w:sz w:val="18"/>
                 <w:szCs w:val="18"/>
               </w:rPr>
-              <w:t xml:space="preserve">28</w:t>
+              <w:t xml:space="preserve">31</w:t>
             </w:r>
           </w:p>
         </w:tc>
@@ -2085,7 +2099,7 @@
                 <w:sz w:val="18"/>
                 <w:szCs w:val="18"/>
               </w:rPr>
-              <w:t xml:space="preserve">16</w:t>
+              <w:t xml:space="preserve">15</w:t>
             </w:r>
           </w:p>
         </w:tc>
@@ -2123,7 +2137,7 @@
                 <w:sz w:val="18"/>
                 <w:szCs w:val="18"/>
               </w:rPr>
-              <w:t xml:space="preserve">52,2</w:t>
+              <w:t xml:space="preserve">54,2</w:t>
             </w:r>
           </w:p>
         </w:tc>
@@ -2159,7 +2173,7 @@
                 <w:sz w:val="18"/>
                 <w:szCs w:val="18"/>
               </w:rPr>
-              <w:t xml:space="preserve">22,5</w:t>
+              <w:t xml:space="preserve">22,4</w:t>
             </w:r>
           </w:p>
         </w:tc>
@@ -2256,7 +2270,7 @@
           <w:sz w:val="20"/>
           <w:szCs w:val="20"/>
         </w:rPr>
-        <w:t xml:space="preserve">4.4. A Intermediação Se Concentra em Uma Interseção na Urca</w:t>
+        <w:t xml:space="preserve">4.4. A Intermediação Se Concentra no Corredor da Urca</w:t>
       </w:r>
     </w:p>
     <w:p>
@@ -2270,7 +2284,7 @@
           <w:sz w:val="20"/>
           <w:szCs w:val="20"/>
         </w:rPr>
-        <w:t xml:space="preserve">A centralidade de intermediação dirigida, ponderada pelo tempo de percurso, é compatível com a leitura do fluxo de acesso nos três bairros (Figura 4). Na Urca, uma única interseção está presente em 52% de todos os pares origem-destino de tempo mínimo, exatamente a que fica no gargalo do corredor de acesso. Copacabana e Botafogo não têm um vértice tão dominante: suas interseções mais centrais alcançam 27,8% e 22,5%, respectivamente, com a carga distribuída ao longo de um eixo arterial em forma de Y em Copacabana e ao longo de eixos paralelos em Botafogo. O valor de Copacabana fica um pouco acima do de Botafogo, mais um indicador em que as duas malhas abertas deixam de se acompanhar exatamente depois da correção de Copacabana (Seção 5). Reportamos o máximo, e não um índice de concentração, porque este último é confundido pelo tamanho do núcleo (um núcleo pequeno eleva a mediana e reduz a desigualdade independentemente da geografia); o máximo, já normalizado pelo número de pares, é comparável entre tamanhos distintos e volta a isolar a Urca.</w:t>
+        <w:t xml:space="preserve">A centralidade de intermediação dirigida, ponderada pelo tempo de percurso, é compatível com a leitura do fluxo de acesso nos três bairros (Figura 4). Na Urca, as cinco interseções mais centrais, todas ao longo do corredor que liga as duas malhas e em suas junções com elas, estão presentes em 45,8% a 54,2% de todos os pares origem-destino de tempo mínimo. Copacabana e Botafogo não têm vértices tão dominantes: suas interseções mais centrais alcançam 27,8% e 22,4%, respectivamente, com a carga distribuída ao longo de um eixo arterial em forma de Y em Copacabana e ao longo de eixos paralelos em Botafogo. O valor de Copacabana fica um pouco acima do de Botafogo, mais um indicador em que as duas malhas abertas não se acompanham exatamente (Seção 5). Reportamos o máximo, e não um índice de concentração, porque este último é confundido pelo tamanho do núcleo (um núcleo pequeno eleva a mediana e reduz a desigualdade independentemente da geografia); o máximo, já normalizado pelo número de pares, é comparável entre tamanhos distintos e volta a isolar a Urca.</w:t>
       </w:r>
     </w:p>
     <w:p>
@@ -2281,7 +2295,7 @@
       <w:r>
         <w:drawing>
           <wp:inline distT="0" distB="0" distL="0" distR="0">
-            <wp:extent cx="4381500" cy="1704975"/>
+            <wp:extent cx="4381500" cy="1581150"/>
             <wp:effectExtent t="0" r="0" b="0" l="0"/>
             <wp:docPr id="1" name="" descr="" title=""/>
             <wp:cNvGraphicFramePr>
@@ -2306,7 +2320,7 @@
                   <pic:spPr bwMode="auto">
                     <a:xfrm>
                       <a:off x="0" y="0"/>
-                      <a:ext cx="4381500" cy="1704975"/>
+                      <a:ext cx="4381500" cy="1581150"/>
                     </a:xfrm>
                     <a:prstGeom prst="rect">
                       <a:avLst/>
@@ -2330,7 +2344,7 @@
           <w:sz w:val="18"/>
           <w:szCs w:val="18"/>
         </w:rPr>
-        <w:t xml:space="preserve">Figura 4 - Centralidade de intermediação dirigida (caminhos de tempo mínimo, núcleo forte). O corredor de acesso da Urca é um único ponto crítico; a carga de Copacabana se concentra ao longo de um eixo arterial em forma de Y, e a de Botafogo ao longo de eixos paralelos, ambos com um máximo bem mais baixo do que o da Urca.</w:t>
+        <w:t xml:space="preserve">Figura 4 - Centralidade de intermediação dirigida (caminhos de tempo mínimo, núcleo forte). A intermediação da Urca se concentra ao longo do corredor de acesso e em suas junções; a carga de Copacabana se concentra ao longo de um eixo arterial em forma de Y, e a de Botafogo ao longo de eixos paralelos, ambos com um máximo bem mais baixo do que o da Urca.</w:t>
       </w:r>
     </w:p>
     <w:p>
@@ -2359,7 +2373,7 @@
           <w:sz w:val="20"/>
           <w:szCs w:val="20"/>
         </w:rPr>
-        <w:t xml:space="preserve">Medimos a resiliência de modo exaustivo, fechando cada ponte forte ou articulação forte por vez e contando, sobre todos os pares ordenados do núcleo, quantos perdem toda a conexão. Na Urca (1.332 pares do núcleo), a ponte forte mediana desconecta 138 pares, e a pior, 644; a articulação forte mediana desconecta 219, e a pior, 694. Em Copacabana (109.230 pares, na rede corrigida), a ponte forte mediana desconecta 660 pares, e a pior, 14.280; em Botafogo (115.940 pares), 1.016 e 18.122, respectivamente. A fração do núcleo isolada é muito maior na Urca (mediana de 10,4% para pontes fortes, contra 0,6% e 0,9% nas malhas grandes), mas isso é, em parte, um efeito de escala: um único elemento removido corta uma fatia maior de um núcleo pequeno, de modo que as contagens absolutas e o tamanho do núcleo na Tabela 1 devem ser lidos em conjunto. O ponto qualitativo é robusto: em todos os bairros, nenhuma ponte forte é inofensiva, a menos danosa ainda isola um número não trivial de pares, e o impacto de um elemento não é uma propriedade fixa, mas depende de qual par é considerado.</w:t>
+        <w:t xml:space="preserve">Medimos a resiliência de modo exaustivo, fechando cada ponte forte ou articulação forte por vez e contando, sobre todos os pares ordenados do núcleo, quantos perdem toda a conexão. Na Urca (4.160 pares do núcleo), a ponte forte mediana desconecta 250 pares, e a pior, 2.112; a articulação forte mediana desconecta 341,5, e a pior, 2.251. Em Copacabana (109.230 pares), a ponte forte mediana desconecta 660 pares, e a pior, 14.280; em Botafogo (153.272 pares), 782 e 12.818, respectivamente. A fração do núcleo isolada é maior na Urca (mediana de 6,0% para pontes fortes, contra 0,6% e 0,5% nas malhas grandes), mas isso é, em parte, um efeito de escala: um único elemento removido corta uma fatia maior de um núcleo pequeno, de modo que as contagens absolutas e o tamanho do núcleo na Tabela 1 devem ser lidos em conjunto. O ponto qualitativo é robusto: em todos os bairros, nenhuma ponte forte é inofensiva, a menos danosa ainda isola um número não trivial de pares, e o impacto de um elemento não é uma propriedade fixa, mas depende de qual par é considerado.</w:t>
       </w:r>
     </w:p>
     <w:p>
@@ -2373,8 +2387,1127 @@
           <w:sz w:val="20"/>
           <w:szCs w:val="20"/>
         </w:rPr>
-        <w:t xml:space="preserve">Além da conectividade binária, um desvio forçado tem um custo mensurável. Recalcular a rota mais curta após bloquear, ao longo dela, um trecho que não seja ponte aumenta o tempo de percurso em 13,6% na Urca, 5,1% em Copacabana e 6,0% em Botafogo. Essas mesmas rotas também atravessam trechos que são, eles próprios, pontes fortes (3, 4 e 1, respectivamente): fechar qualquer um deles não admite desvio algum, apenas a desconexão já quantificada acima.</w:t>
-      </w:r>
+        <w:t xml:space="preserve">Além da conectividade binária, um desvio forçado tem um custo mensurável. Recalcular a rota mais curta após bloquear, ao longo dela, um trecho que não seja ponte aumenta o tempo de percurso em 13,6% na Urca, 5,1% em Copacabana e 1,8% em Botafogo. Essas mesmas rotas também atravessam trechos que são, eles próprios, pontes fortes (3, 4 e 6, respectivamente): fechar qualquer um deles não admite desvio algum, apenas a desconexão já quantificada acima. Esse indicador é o mais frágil do artigo: o par origem-destino é escolhido por uma heurística sobre o próprio grafo e muda com o recorte (em Botafogo, o acréscimo era de 6,0% com o retângulo manual), de modo que o lemos como ilustração, não como evidência.</w:t>
+      </w:r>
+    </w:p>
+    <w:p>
+      <w:pPr>
+        <w:spacing w:after="120" w:before="240"/>
+      </w:pPr>
+      <w:r>
+        <w:rPr>
+          <w:rFonts w:ascii="Georgia" w:cs="Georgia" w:eastAsia="Georgia" w:hAnsi="Georgia"/>
+          <w:b/>
+          <w:bCs/>
+          <w:sz w:val="20"/>
+          <w:szCs w:val="20"/>
+        </w:rPr>
+        <w:t xml:space="preserve">4.6. Sensibilidade ao Tipo de Recorte</w:t>
+      </w:r>
+    </w:p>
+    <w:p>
+      <w:pPr>
+        <w:spacing w:after="120"/>
+        <w:jc w:val="both"/>
+      </w:pPr>
+      <w:r>
+        <w:rPr>
+          <w:rFonts w:ascii="Georgia" w:cs="Georgia" w:eastAsia="Georgia" w:hAnsi="Georgia"/>
+          <w:sz w:val="20"/>
+          <w:szCs w:val="20"/>
+        </w:rPr>
+        <w:t xml:space="preserve">A Tabela 4 repete as medidas centrais com o retângulo manual, sem recorte e com a fronteira das portas de acesso definida pelo próprio retângulo, e com o polígono oficial (a versão usada no restante do artigo). O recorte pouco afeta Botafogo (pontes fortes de 70,4% para 68,4%; fluxo de acesso de 16 para 15), mas altera bastante os outros dois bairros. Em Copacabana, o retângulo incluía interseções de Botafogo, e o recorte reduz as pontes fortes de 53,1% para 45,3% e as portas de 45 para 21. Na Urca, o retângulo truncava a península, e o recorte leva o núcleo forte de 37 para 65 interseções e a fração de interseções fora dele de 38,3% para 7,1%. Duas conclusões seguem. Primeiro, a diferença de pontes fortes entre Copacabana e Botafogo não é efeito do pré-processamento desigual: ela existe nos dois recortes (53,1% contra 70,4% com o retângulo; 45,3% contra 68,4% com o polígono). Segundo, o fluxo de acesso separa os casos nos dois recortes (1 na Urca, contra 13 a 18 em Copacabana e 15 a 16 em Botafogo), e a intermediação máxima da Urca (52,2% a 54,2%) permanece a maior. Já a fração de interseções fora do núcleo forte da Urca e o número de portas dependem do recorte e devem ser lidos com cautela. Por isso a comparação principal usa o mesmo polígono nos três bairros.</w:t>
+      </w:r>
+    </w:p>
+    <w:p>
+      <w:pPr>
+        <w:spacing w:after="120" w:before="240"/>
+        <w:jc w:val="center"/>
+      </w:pPr>
+      <w:r>
+        <w:rPr>
+          <w:rFonts w:ascii="Georgia" w:cs="Georgia" w:eastAsia="Georgia" w:hAnsi="Georgia"/>
+          <w:b/>
+          <w:bCs/>
+          <w:sz w:val="18"/>
+          <w:szCs w:val="18"/>
+        </w:rPr>
+        <w:t xml:space="preserve">Tabela 4 - Sensibilidade ao tipo de recorte. Retângulo: retângulo manual sem recorte, com as portas de acesso na borda do retângulo. Polígono: polígono oficial (versão do artigo). V: interseções; Fora: % de V fora do núcleo forte; Pontes: % de pontes fortes; Fluxo: fluxo de acesso (f = 0,2); Interm.: intermediação máxima (% dos pares)</w:t>
+      </w:r>
+    </w:p>
+    <w:tbl>
+      <w:tblPr>
+        <w:tblW w:type="dxa" w:w="8400"/>
+        <w:tblBorders>
+          <w:top w:val="single" w:color="auto" w:sz="4"/>
+          <w:left w:val="single" w:color="auto" w:sz="4"/>
+          <w:bottom w:val="single" w:color="auto" w:sz="4"/>
+          <w:right w:val="single" w:color="auto" w:sz="4"/>
+          <w:insideH w:val="single" w:color="auto" w:sz="4"/>
+          <w:insideV w:val="single" w:color="auto" w:sz="4"/>
+        </w:tblBorders>
+      </w:tblPr>
+      <w:tblGrid>
+        <w:gridCol w:w="1500"/>
+        <w:gridCol w:w="1300"/>
+        <w:gridCol w:w="800"/>
+        <w:gridCol w:w="900"/>
+        <w:gridCol w:w="1000"/>
+        <w:gridCol w:w="1000"/>
+        <w:gridCol w:w="900"/>
+        <w:gridCol w:w="1000"/>
+      </w:tblGrid>
+      <w:tr>
+        <w:tc>
+          <w:tcPr>
+            <w:tcW w:type="dxa" w:w="1500"/>
+            <w:shd w:fill="E8E8E8" w:val="clear"/>
+          </w:tcPr>
+          <w:p>
+            <w:pPr>
+              <w:jc w:val="center"/>
+            </w:pPr>
+            <w:r>
+              <w:rPr>
+                <w:rFonts w:ascii="Georgia" w:cs="Georgia" w:eastAsia="Georgia" w:hAnsi="Georgia"/>
+                <w:b/>
+                <w:bCs/>
+                <w:sz w:val="18"/>
+                <w:szCs w:val="18"/>
+              </w:rPr>
+              <w:t xml:space="preserve">Bairro</w:t>
+            </w:r>
+          </w:p>
+        </w:tc>
+        <w:tc>
+          <w:tcPr>
+            <w:tcW w:type="dxa" w:w="1300"/>
+            <w:shd w:fill="E8E8E8" w:val="clear"/>
+          </w:tcPr>
+          <w:p>
+            <w:pPr>
+              <w:jc w:val="center"/>
+            </w:pPr>
+            <w:r>
+              <w:rPr>
+                <w:rFonts w:ascii="Georgia" w:cs="Georgia" w:eastAsia="Georgia" w:hAnsi="Georgia"/>
+                <w:b/>
+                <w:bCs/>
+                <w:sz w:val="18"/>
+                <w:szCs w:val="18"/>
+              </w:rPr>
+              <w:t xml:space="preserve">Recorte</w:t>
+            </w:r>
+          </w:p>
+        </w:tc>
+        <w:tc>
+          <w:tcPr>
+            <w:tcW w:type="dxa" w:w="800"/>
+            <w:shd w:fill="E8E8E8" w:val="clear"/>
+          </w:tcPr>
+          <w:p>
+            <w:pPr>
+              <w:jc w:val="center"/>
+            </w:pPr>
+            <w:r>
+              <w:rPr>
+                <w:rFonts w:ascii="Georgia" w:cs="Georgia" w:eastAsia="Georgia" w:hAnsi="Georgia"/>
+                <w:b/>
+                <w:bCs/>
+                <w:sz w:val="18"/>
+                <w:szCs w:val="18"/>
+              </w:rPr>
+              <w:t xml:space="preserve">V</w:t>
+            </w:r>
+          </w:p>
+        </w:tc>
+        <w:tc>
+          <w:tcPr>
+            <w:tcW w:type="dxa" w:w="900"/>
+            <w:shd w:fill="E8E8E8" w:val="clear"/>
+          </w:tcPr>
+          <w:p>
+            <w:pPr>
+              <w:jc w:val="center"/>
+            </w:pPr>
+            <w:r>
+              <w:rPr>
+                <w:rFonts w:ascii="Georgia" w:cs="Georgia" w:eastAsia="Georgia" w:hAnsi="Georgia"/>
+                <w:b/>
+                <w:bCs/>
+                <w:sz w:val="18"/>
+                <w:szCs w:val="18"/>
+              </w:rPr>
+              <w:t xml:space="preserve">Fora</w:t>
+            </w:r>
+          </w:p>
+        </w:tc>
+        <w:tc>
+          <w:tcPr>
+            <w:tcW w:type="dxa" w:w="1000"/>
+            <w:shd w:fill="E8E8E8" w:val="clear"/>
+          </w:tcPr>
+          <w:p>
+            <w:pPr>
+              <w:jc w:val="center"/>
+            </w:pPr>
+            <w:r>
+              <w:rPr>
+                <w:rFonts w:ascii="Georgia" w:cs="Georgia" w:eastAsia="Georgia" w:hAnsi="Georgia"/>
+                <w:b/>
+                <w:bCs/>
+                <w:sz w:val="18"/>
+                <w:szCs w:val="18"/>
+              </w:rPr>
+              <w:t xml:space="preserve">Pontes</w:t>
+            </w:r>
+          </w:p>
+        </w:tc>
+        <w:tc>
+          <w:tcPr>
+            <w:tcW w:type="dxa" w:w="1000"/>
+            <w:shd w:fill="E8E8E8" w:val="clear"/>
+          </w:tcPr>
+          <w:p>
+            <w:pPr>
+              <w:jc w:val="center"/>
+            </w:pPr>
+            <w:r>
+              <w:rPr>
+                <w:rFonts w:ascii="Georgia" w:cs="Georgia" w:eastAsia="Georgia" w:hAnsi="Georgia"/>
+                <w:b/>
+                <w:bCs/>
+                <w:sz w:val="18"/>
+                <w:szCs w:val="18"/>
+              </w:rPr>
+              <w:t xml:space="preserve">Portas</w:t>
+            </w:r>
+          </w:p>
+        </w:tc>
+        <w:tc>
+          <w:tcPr>
+            <w:tcW w:type="dxa" w:w="900"/>
+            <w:shd w:fill="E8E8E8" w:val="clear"/>
+          </w:tcPr>
+          <w:p>
+            <w:pPr>
+              <w:jc w:val="center"/>
+            </w:pPr>
+            <w:r>
+              <w:rPr>
+                <w:rFonts w:ascii="Georgia" w:cs="Georgia" w:eastAsia="Georgia" w:hAnsi="Georgia"/>
+                <w:b/>
+                <w:bCs/>
+                <w:sz w:val="18"/>
+                <w:szCs w:val="18"/>
+              </w:rPr>
+              <w:t xml:space="preserve">Fluxo</w:t>
+            </w:r>
+          </w:p>
+        </w:tc>
+        <w:tc>
+          <w:tcPr>
+            <w:tcW w:type="dxa" w:w="1000"/>
+            <w:shd w:fill="E8E8E8" w:val="clear"/>
+          </w:tcPr>
+          <w:p>
+            <w:pPr>
+              <w:jc w:val="center"/>
+            </w:pPr>
+            <w:r>
+              <w:rPr>
+                <w:rFonts w:ascii="Georgia" w:cs="Georgia" w:eastAsia="Georgia" w:hAnsi="Georgia"/>
+                <w:b/>
+                <w:bCs/>
+                <w:sz w:val="18"/>
+                <w:szCs w:val="18"/>
+              </w:rPr>
+              <w:t xml:space="preserve">Interm.</w:t>
+            </w:r>
+          </w:p>
+        </w:tc>
+      </w:tr>
+      <w:tr>
+        <w:tc>
+          <w:tcPr>
+            <w:tcW w:type="dxa" w:w="1500"/>
+          </w:tcPr>
+          <w:p>
+            <w:pPr>
+              <w:jc w:val="left"/>
+            </w:pPr>
+            <w:r>
+              <w:rPr>
+                <w:rFonts w:ascii="Georgia" w:cs="Georgia" w:eastAsia="Georgia" w:hAnsi="Georgia"/>
+                <w:sz w:val="18"/>
+                <w:szCs w:val="18"/>
+              </w:rPr>
+              <w:t xml:space="preserve">Urca</w:t>
+            </w:r>
+          </w:p>
+        </w:tc>
+        <w:tc>
+          <w:tcPr>
+            <w:tcW w:type="dxa" w:w="1300"/>
+          </w:tcPr>
+          <w:p>
+            <w:pPr>
+              <w:jc w:val="center"/>
+            </w:pPr>
+            <w:r>
+              <w:rPr>
+                <w:rFonts w:ascii="Georgia" w:cs="Georgia" w:eastAsia="Georgia" w:hAnsi="Georgia"/>
+                <w:sz w:val="18"/>
+                <w:szCs w:val="18"/>
+              </w:rPr>
+              <w:t xml:space="preserve">retângulo</w:t>
+            </w:r>
+          </w:p>
+        </w:tc>
+        <w:tc>
+          <w:tcPr>
+            <w:tcW w:type="dxa" w:w="800"/>
+          </w:tcPr>
+          <w:p>
+            <w:pPr>
+              <w:jc w:val="center"/>
+            </w:pPr>
+            <w:r>
+              <w:rPr>
+                <w:rFonts w:ascii="Georgia" w:cs="Georgia" w:eastAsia="Georgia" w:hAnsi="Georgia"/>
+                <w:sz w:val="18"/>
+                <w:szCs w:val="18"/>
+              </w:rPr>
+              <w:t xml:space="preserve">60</w:t>
+            </w:r>
+          </w:p>
+        </w:tc>
+        <w:tc>
+          <w:tcPr>
+            <w:tcW w:type="dxa" w:w="900"/>
+          </w:tcPr>
+          <w:p>
+            <w:pPr>
+              <w:jc w:val="center"/>
+            </w:pPr>
+            <w:r>
+              <w:rPr>
+                <w:rFonts w:ascii="Georgia" w:cs="Georgia" w:eastAsia="Georgia" w:hAnsi="Georgia"/>
+                <w:sz w:val="18"/>
+                <w:szCs w:val="18"/>
+              </w:rPr>
+              <w:t xml:space="preserve">38,3</w:t>
+            </w:r>
+          </w:p>
+        </w:tc>
+        <w:tc>
+          <w:tcPr>
+            <w:tcW w:type="dxa" w:w="1000"/>
+          </w:tcPr>
+          <w:p>
+            <w:pPr>
+              <w:jc w:val="center"/>
+            </w:pPr>
+            <w:r>
+              <w:rPr>
+                <w:rFonts w:ascii="Georgia" w:cs="Georgia" w:eastAsia="Georgia" w:hAnsi="Georgia"/>
+                <w:sz w:val="18"/>
+                <w:szCs w:val="18"/>
+              </w:rPr>
+              <w:t xml:space="preserve">67,3</w:t>
+            </w:r>
+          </w:p>
+        </w:tc>
+        <w:tc>
+          <w:tcPr>
+            <w:tcW w:type="dxa" w:w="1000"/>
+          </w:tcPr>
+          <w:p>
+            <w:pPr>
+              <w:jc w:val="center"/>
+            </w:pPr>
+            <w:r>
+              <w:rPr>
+                <w:rFonts w:ascii="Georgia" w:cs="Georgia" w:eastAsia="Georgia" w:hAnsi="Georgia"/>
+                <w:sz w:val="18"/>
+                <w:szCs w:val="18"/>
+              </w:rPr>
+              <w:t xml:space="preserve">4</w:t>
+            </w:r>
+          </w:p>
+        </w:tc>
+        <w:tc>
+          <w:tcPr>
+            <w:tcW w:type="dxa" w:w="900"/>
+          </w:tcPr>
+          <w:p>
+            <w:pPr>
+              <w:jc w:val="center"/>
+            </w:pPr>
+            <w:r>
+              <w:rPr>
+                <w:rFonts w:ascii="Georgia" w:cs="Georgia" w:eastAsia="Georgia" w:hAnsi="Georgia"/>
+                <w:sz w:val="18"/>
+                <w:szCs w:val="18"/>
+              </w:rPr>
+              <w:t xml:space="preserve">1</w:t>
+            </w:r>
+          </w:p>
+        </w:tc>
+        <w:tc>
+          <w:tcPr>
+            <w:tcW w:type="dxa" w:w="1000"/>
+          </w:tcPr>
+          <w:p>
+            <w:pPr>
+              <w:jc w:val="center"/>
+            </w:pPr>
+            <w:r>
+              <w:rPr>
+                <w:rFonts w:ascii="Georgia" w:cs="Georgia" w:eastAsia="Georgia" w:hAnsi="Georgia"/>
+                <w:sz w:val="18"/>
+                <w:szCs w:val="18"/>
+              </w:rPr>
+              <w:t xml:space="preserve">52,2</w:t>
+            </w:r>
+          </w:p>
+        </w:tc>
+      </w:tr>
+      <w:tr>
+        <w:tc>
+          <w:tcPr>
+            <w:tcW w:type="dxa" w:w="1500"/>
+          </w:tcPr>
+          <w:p>
+            <w:pPr>
+              <w:jc w:val="left"/>
+            </w:pPr>
+            <w:r>
+              <w:rPr>
+                <w:rFonts w:ascii="Georgia" w:cs="Georgia" w:eastAsia="Georgia" w:hAnsi="Georgia"/>
+                <w:sz w:val="18"/>
+                <w:szCs w:val="18"/>
+              </w:rPr>
+              <w:t xml:space="preserve"/>
+            </w:r>
+          </w:p>
+        </w:tc>
+        <w:tc>
+          <w:tcPr>
+            <w:tcW w:type="dxa" w:w="1300"/>
+          </w:tcPr>
+          <w:p>
+            <w:pPr>
+              <w:jc w:val="center"/>
+            </w:pPr>
+            <w:r>
+              <w:rPr>
+                <w:rFonts w:ascii="Georgia" w:cs="Georgia" w:eastAsia="Georgia" w:hAnsi="Georgia"/>
+                <w:sz w:val="18"/>
+                <w:szCs w:val="18"/>
+              </w:rPr>
+              <w:t xml:space="preserve">polígono</w:t>
+            </w:r>
+          </w:p>
+        </w:tc>
+        <w:tc>
+          <w:tcPr>
+            <w:tcW w:type="dxa" w:w="800"/>
+          </w:tcPr>
+          <w:p>
+            <w:pPr>
+              <w:jc w:val="center"/>
+            </w:pPr>
+            <w:r>
+              <w:rPr>
+                <w:rFonts w:ascii="Georgia" w:cs="Georgia" w:eastAsia="Georgia" w:hAnsi="Georgia"/>
+                <w:sz w:val="18"/>
+                <w:szCs w:val="18"/>
+              </w:rPr>
+              <w:t xml:space="preserve">70</w:t>
+            </w:r>
+          </w:p>
+        </w:tc>
+        <w:tc>
+          <w:tcPr>
+            <w:tcW w:type="dxa" w:w="900"/>
+          </w:tcPr>
+          <w:p>
+            <w:pPr>
+              <w:jc w:val="center"/>
+            </w:pPr>
+            <w:r>
+              <w:rPr>
+                <w:rFonts w:ascii="Georgia" w:cs="Georgia" w:eastAsia="Georgia" w:hAnsi="Georgia"/>
+                <w:sz w:val="18"/>
+                <w:szCs w:val="18"/>
+              </w:rPr>
+              <w:t xml:space="preserve">7,1</w:t>
+            </w:r>
+          </w:p>
+        </w:tc>
+        <w:tc>
+          <w:tcPr>
+            <w:tcW w:type="dxa" w:w="1000"/>
+          </w:tcPr>
+          <w:p>
+            <w:pPr>
+              <w:jc w:val="center"/>
+            </w:pPr>
+            <w:r>
+              <w:rPr>
+                <w:rFonts w:ascii="Georgia" w:cs="Georgia" w:eastAsia="Georgia" w:hAnsi="Georgia"/>
+                <w:sz w:val="18"/>
+                <w:szCs w:val="18"/>
+              </w:rPr>
+              <w:t xml:space="preserve">61,5</w:t>
+            </w:r>
+          </w:p>
+        </w:tc>
+        <w:tc>
+          <w:tcPr>
+            <w:tcW w:type="dxa" w:w="1000"/>
+          </w:tcPr>
+          <w:p>
+            <w:pPr>
+              <w:jc w:val="center"/>
+            </w:pPr>
+            <w:r>
+              <w:rPr>
+                <w:rFonts w:ascii="Georgia" w:cs="Georgia" w:eastAsia="Georgia" w:hAnsi="Georgia"/>
+                <w:sz w:val="18"/>
+                <w:szCs w:val="18"/>
+              </w:rPr>
+              <w:t xml:space="preserve">3</w:t>
+            </w:r>
+          </w:p>
+        </w:tc>
+        <w:tc>
+          <w:tcPr>
+            <w:tcW w:type="dxa" w:w="900"/>
+          </w:tcPr>
+          <w:p>
+            <w:pPr>
+              <w:jc w:val="center"/>
+            </w:pPr>
+            <w:r>
+              <w:rPr>
+                <w:rFonts w:ascii="Georgia" w:cs="Georgia" w:eastAsia="Georgia" w:hAnsi="Georgia"/>
+                <w:sz w:val="18"/>
+                <w:szCs w:val="18"/>
+              </w:rPr>
+              <w:t xml:space="preserve">1</w:t>
+            </w:r>
+          </w:p>
+        </w:tc>
+        <w:tc>
+          <w:tcPr>
+            <w:tcW w:type="dxa" w:w="1000"/>
+          </w:tcPr>
+          <w:p>
+            <w:pPr>
+              <w:jc w:val="center"/>
+            </w:pPr>
+            <w:r>
+              <w:rPr>
+                <w:rFonts w:ascii="Georgia" w:cs="Georgia" w:eastAsia="Georgia" w:hAnsi="Georgia"/>
+                <w:sz w:val="18"/>
+                <w:szCs w:val="18"/>
+              </w:rPr>
+              <w:t xml:space="preserve">54,2</w:t>
+            </w:r>
+          </w:p>
+        </w:tc>
+      </w:tr>
+      <w:tr>
+        <w:tc>
+          <w:tcPr>
+            <w:tcW w:type="dxa" w:w="1500"/>
+          </w:tcPr>
+          <w:p>
+            <w:pPr>
+              <w:jc w:val="left"/>
+            </w:pPr>
+            <w:r>
+              <w:rPr>
+                <w:rFonts w:ascii="Georgia" w:cs="Georgia" w:eastAsia="Georgia" w:hAnsi="Georgia"/>
+                <w:sz w:val="18"/>
+                <w:szCs w:val="18"/>
+              </w:rPr>
+              <w:t xml:space="preserve">Copacabana</w:t>
+            </w:r>
+          </w:p>
+        </w:tc>
+        <w:tc>
+          <w:tcPr>
+            <w:tcW w:type="dxa" w:w="1300"/>
+          </w:tcPr>
+          <w:p>
+            <w:pPr>
+              <w:jc w:val="center"/>
+            </w:pPr>
+            <w:r>
+              <w:rPr>
+                <w:rFonts w:ascii="Georgia" w:cs="Georgia" w:eastAsia="Georgia" w:hAnsi="Georgia"/>
+                <w:sz w:val="18"/>
+                <w:szCs w:val="18"/>
+              </w:rPr>
+              <w:t xml:space="preserve">retângulo</w:t>
+            </w:r>
+          </w:p>
+        </w:tc>
+        <w:tc>
+          <w:tcPr>
+            <w:tcW w:type="dxa" w:w="800"/>
+          </w:tcPr>
+          <w:p>
+            <w:pPr>
+              <w:jc w:val="center"/>
+            </w:pPr>
+            <w:r>
+              <w:rPr>
+                <w:rFonts w:ascii="Georgia" w:cs="Georgia" w:eastAsia="Georgia" w:hAnsi="Georgia"/>
+                <w:sz w:val="18"/>
+                <w:szCs w:val="18"/>
+              </w:rPr>
+              <w:t xml:space="preserve">496</w:t>
+            </w:r>
+          </w:p>
+        </w:tc>
+        <w:tc>
+          <w:tcPr>
+            <w:tcW w:type="dxa" w:w="900"/>
+          </w:tcPr>
+          <w:p>
+            <w:pPr>
+              <w:jc w:val="center"/>
+            </w:pPr>
+            <w:r>
+              <w:rPr>
+                <w:rFonts w:ascii="Georgia" w:cs="Georgia" w:eastAsia="Georgia" w:hAnsi="Georgia"/>
+                <w:sz w:val="18"/>
+                <w:szCs w:val="18"/>
+              </w:rPr>
+              <w:t xml:space="preserve">19,6</w:t>
+            </w:r>
+          </w:p>
+        </w:tc>
+        <w:tc>
+          <w:tcPr>
+            <w:tcW w:type="dxa" w:w="1000"/>
+          </w:tcPr>
+          <w:p>
+            <w:pPr>
+              <w:jc w:val="center"/>
+            </w:pPr>
+            <w:r>
+              <w:rPr>
+                <w:rFonts w:ascii="Georgia" w:cs="Georgia" w:eastAsia="Georgia" w:hAnsi="Georgia"/>
+                <w:sz w:val="18"/>
+                <w:szCs w:val="18"/>
+              </w:rPr>
+              <w:t xml:space="preserve">53,1</w:t>
+            </w:r>
+          </w:p>
+        </w:tc>
+        <w:tc>
+          <w:tcPr>
+            <w:tcW w:type="dxa" w:w="1000"/>
+          </w:tcPr>
+          <w:p>
+            <w:pPr>
+              <w:jc w:val="center"/>
+            </w:pPr>
+            <w:r>
+              <w:rPr>
+                <w:rFonts w:ascii="Georgia" w:cs="Georgia" w:eastAsia="Georgia" w:hAnsi="Georgia"/>
+                <w:sz w:val="18"/>
+                <w:szCs w:val="18"/>
+              </w:rPr>
+              <w:t xml:space="preserve">45</w:t>
+            </w:r>
+          </w:p>
+        </w:tc>
+        <w:tc>
+          <w:tcPr>
+            <w:tcW w:type="dxa" w:w="900"/>
+          </w:tcPr>
+          <w:p>
+            <w:pPr>
+              <w:jc w:val="center"/>
+            </w:pPr>
+            <w:r>
+              <w:rPr>
+                <w:rFonts w:ascii="Georgia" w:cs="Georgia" w:eastAsia="Georgia" w:hAnsi="Georgia"/>
+                <w:sz w:val="18"/>
+                <w:szCs w:val="18"/>
+              </w:rPr>
+              <w:t xml:space="preserve">13</w:t>
+            </w:r>
+          </w:p>
+        </w:tc>
+        <w:tc>
+          <w:tcPr>
+            <w:tcW w:type="dxa" w:w="1000"/>
+          </w:tcPr>
+          <w:p>
+            <w:pPr>
+              <w:jc w:val="center"/>
+            </w:pPr>
+            <w:r>
+              <w:rPr>
+                <w:rFonts w:ascii="Georgia" w:cs="Georgia" w:eastAsia="Georgia" w:hAnsi="Georgia"/>
+                <w:sz w:val="18"/>
+                <w:szCs w:val="18"/>
+              </w:rPr>
+              <w:t xml:space="preserve">30,2</w:t>
+            </w:r>
+          </w:p>
+        </w:tc>
+      </w:tr>
+      <w:tr>
+        <w:tc>
+          <w:tcPr>
+            <w:tcW w:type="dxa" w:w="1500"/>
+          </w:tcPr>
+          <w:p>
+            <w:pPr>
+              <w:jc w:val="left"/>
+            </w:pPr>
+            <w:r>
+              <w:rPr>
+                <w:rFonts w:ascii="Georgia" w:cs="Georgia" w:eastAsia="Georgia" w:hAnsi="Georgia"/>
+                <w:sz w:val="18"/>
+                <w:szCs w:val="18"/>
+              </w:rPr>
+              <w:t xml:space="preserve"/>
+            </w:r>
+          </w:p>
+        </w:tc>
+        <w:tc>
+          <w:tcPr>
+            <w:tcW w:type="dxa" w:w="1300"/>
+          </w:tcPr>
+          <w:p>
+            <w:pPr>
+              <w:jc w:val="center"/>
+            </w:pPr>
+            <w:r>
+              <w:rPr>
+                <w:rFonts w:ascii="Georgia" w:cs="Georgia" w:eastAsia="Georgia" w:hAnsi="Georgia"/>
+                <w:sz w:val="18"/>
+                <w:szCs w:val="18"/>
+              </w:rPr>
+              <w:t xml:space="preserve">polígono</w:t>
+            </w:r>
+          </w:p>
+        </w:tc>
+        <w:tc>
+          <w:tcPr>
+            <w:tcW w:type="dxa" w:w="800"/>
+          </w:tcPr>
+          <w:p>
+            <w:pPr>
+              <w:jc w:val="center"/>
+            </w:pPr>
+            <w:r>
+              <w:rPr>
+                <w:rFonts w:ascii="Georgia" w:cs="Georgia" w:eastAsia="Georgia" w:hAnsi="Georgia"/>
+                <w:sz w:val="18"/>
+                <w:szCs w:val="18"/>
+              </w:rPr>
+              <w:t xml:space="preserve">345</w:t>
+            </w:r>
+          </w:p>
+        </w:tc>
+        <w:tc>
+          <w:tcPr>
+            <w:tcW w:type="dxa" w:w="900"/>
+          </w:tcPr>
+          <w:p>
+            <w:pPr>
+              <w:jc w:val="center"/>
+            </w:pPr>
+            <w:r>
+              <w:rPr>
+                <w:rFonts w:ascii="Georgia" w:cs="Georgia" w:eastAsia="Georgia" w:hAnsi="Georgia"/>
+                <w:sz w:val="18"/>
+                <w:szCs w:val="18"/>
+              </w:rPr>
+              <w:t xml:space="preserve">4,1</w:t>
+            </w:r>
+          </w:p>
+        </w:tc>
+        <w:tc>
+          <w:tcPr>
+            <w:tcW w:type="dxa" w:w="1000"/>
+          </w:tcPr>
+          <w:p>
+            <w:pPr>
+              <w:jc w:val="center"/>
+            </w:pPr>
+            <w:r>
+              <w:rPr>
+                <w:rFonts w:ascii="Georgia" w:cs="Georgia" w:eastAsia="Georgia" w:hAnsi="Georgia"/>
+                <w:sz w:val="18"/>
+                <w:szCs w:val="18"/>
+              </w:rPr>
+              <w:t xml:space="preserve">45,3</w:t>
+            </w:r>
+          </w:p>
+        </w:tc>
+        <w:tc>
+          <w:tcPr>
+            <w:tcW w:type="dxa" w:w="1000"/>
+          </w:tcPr>
+          <w:p>
+            <w:pPr>
+              <w:jc w:val="center"/>
+            </w:pPr>
+            <w:r>
+              <w:rPr>
+                <w:rFonts w:ascii="Georgia" w:cs="Georgia" w:eastAsia="Georgia" w:hAnsi="Georgia"/>
+                <w:sz w:val="18"/>
+                <w:szCs w:val="18"/>
+              </w:rPr>
+              <w:t xml:space="preserve">21</w:t>
+            </w:r>
+          </w:p>
+        </w:tc>
+        <w:tc>
+          <w:tcPr>
+            <w:tcW w:type="dxa" w:w="900"/>
+          </w:tcPr>
+          <w:p>
+            <w:pPr>
+              <w:jc w:val="center"/>
+            </w:pPr>
+            <w:r>
+              <w:rPr>
+                <w:rFonts w:ascii="Georgia" w:cs="Georgia" w:eastAsia="Georgia" w:hAnsi="Georgia"/>
+                <w:sz w:val="18"/>
+                <w:szCs w:val="18"/>
+              </w:rPr>
+              <w:t xml:space="preserve">18</w:t>
+            </w:r>
+          </w:p>
+        </w:tc>
+        <w:tc>
+          <w:tcPr>
+            <w:tcW w:type="dxa" w:w="1000"/>
+          </w:tcPr>
+          <w:p>
+            <w:pPr>
+              <w:jc w:val="center"/>
+            </w:pPr>
+            <w:r>
+              <w:rPr>
+                <w:rFonts w:ascii="Georgia" w:cs="Georgia" w:eastAsia="Georgia" w:hAnsi="Georgia"/>
+                <w:sz w:val="18"/>
+                <w:szCs w:val="18"/>
+              </w:rPr>
+              <w:t xml:space="preserve">27,8</w:t>
+            </w:r>
+          </w:p>
+        </w:tc>
+      </w:tr>
+      <w:tr>
+        <w:tc>
+          <w:tcPr>
+            <w:tcW w:type="dxa" w:w="1500"/>
+          </w:tcPr>
+          <w:p>
+            <w:pPr>
+              <w:jc w:val="left"/>
+            </w:pPr>
+            <w:r>
+              <w:rPr>
+                <w:rFonts w:ascii="Georgia" w:cs="Georgia" w:eastAsia="Georgia" w:hAnsi="Georgia"/>
+                <w:sz w:val="18"/>
+                <w:szCs w:val="18"/>
+              </w:rPr>
+              <w:t xml:space="preserve">Botafogo</w:t>
+            </w:r>
+          </w:p>
+        </w:tc>
+        <w:tc>
+          <w:tcPr>
+            <w:tcW w:type="dxa" w:w="1300"/>
+          </w:tcPr>
+          <w:p>
+            <w:pPr>
+              <w:jc w:val="center"/>
+            </w:pPr>
+            <w:r>
+              <w:rPr>
+                <w:rFonts w:ascii="Georgia" w:cs="Georgia" w:eastAsia="Georgia" w:hAnsi="Georgia"/>
+                <w:sz w:val="18"/>
+                <w:szCs w:val="18"/>
+              </w:rPr>
+              <w:t xml:space="preserve">retângulo</w:t>
+            </w:r>
+          </w:p>
+        </w:tc>
+        <w:tc>
+          <w:tcPr>
+            <w:tcW w:type="dxa" w:w="800"/>
+          </w:tcPr>
+          <w:p>
+            <w:pPr>
+              <w:jc w:val="center"/>
+            </w:pPr>
+            <w:r>
+              <w:rPr>
+                <w:rFonts w:ascii="Georgia" w:cs="Georgia" w:eastAsia="Georgia" w:hAnsi="Georgia"/>
+                <w:sz w:val="18"/>
+                <w:szCs w:val="18"/>
+              </w:rPr>
+              <w:t xml:space="preserve">398</w:t>
+            </w:r>
+          </w:p>
+        </w:tc>
+        <w:tc>
+          <w:tcPr>
+            <w:tcW w:type="dxa" w:w="900"/>
+          </w:tcPr>
+          <w:p>
+            <w:pPr>
+              <w:jc w:val="center"/>
+            </w:pPr>
+            <w:r>
+              <w:rPr>
+                <w:rFonts w:ascii="Georgia" w:cs="Georgia" w:eastAsia="Georgia" w:hAnsi="Georgia"/>
+                <w:sz w:val="18"/>
+                <w:szCs w:val="18"/>
+              </w:rPr>
+              <w:t xml:space="preserve">14,3</w:t>
+            </w:r>
+          </w:p>
+        </w:tc>
+        <w:tc>
+          <w:tcPr>
+            <w:tcW w:type="dxa" w:w="1000"/>
+          </w:tcPr>
+          <w:p>
+            <w:pPr>
+              <w:jc w:val="center"/>
+            </w:pPr>
+            <w:r>
+              <w:rPr>
+                <w:rFonts w:ascii="Georgia" w:cs="Georgia" w:eastAsia="Georgia" w:hAnsi="Georgia"/>
+                <w:sz w:val="18"/>
+                <w:szCs w:val="18"/>
+              </w:rPr>
+              <w:t xml:space="preserve">70,4</w:t>
+            </w:r>
+          </w:p>
+        </w:tc>
+        <w:tc>
+          <w:tcPr>
+            <w:tcW w:type="dxa" w:w="1000"/>
+          </w:tcPr>
+          <w:p>
+            <w:pPr>
+              <w:jc w:val="center"/>
+            </w:pPr>
+            <w:r>
+              <w:rPr>
+                <w:rFonts w:ascii="Georgia" w:cs="Georgia" w:eastAsia="Georgia" w:hAnsi="Georgia"/>
+                <w:sz w:val="18"/>
+                <w:szCs w:val="18"/>
+              </w:rPr>
+              <w:t xml:space="preserve">28</w:t>
+            </w:r>
+          </w:p>
+        </w:tc>
+        <w:tc>
+          <w:tcPr>
+            <w:tcW w:type="dxa" w:w="900"/>
+          </w:tcPr>
+          <w:p>
+            <w:pPr>
+              <w:jc w:val="center"/>
+            </w:pPr>
+            <w:r>
+              <w:rPr>
+                <w:rFonts w:ascii="Georgia" w:cs="Georgia" w:eastAsia="Georgia" w:hAnsi="Georgia"/>
+                <w:sz w:val="18"/>
+                <w:szCs w:val="18"/>
+              </w:rPr>
+              <w:t xml:space="preserve">16</w:t>
+            </w:r>
+          </w:p>
+        </w:tc>
+        <w:tc>
+          <w:tcPr>
+            <w:tcW w:type="dxa" w:w="1000"/>
+          </w:tcPr>
+          <w:p>
+            <w:pPr>
+              <w:jc w:val="center"/>
+            </w:pPr>
+            <w:r>
+              <w:rPr>
+                <w:rFonts w:ascii="Georgia" w:cs="Georgia" w:eastAsia="Georgia" w:hAnsi="Georgia"/>
+                <w:sz w:val="18"/>
+                <w:szCs w:val="18"/>
+              </w:rPr>
+              <w:t xml:space="preserve">22,5</w:t>
+            </w:r>
+          </w:p>
+        </w:tc>
+      </w:tr>
+      <w:tr>
+        <w:tc>
+          <w:tcPr>
+            <w:tcW w:type="dxa" w:w="1500"/>
+          </w:tcPr>
+          <w:p>
+            <w:pPr>
+              <w:jc w:val="left"/>
+            </w:pPr>
+            <w:r>
+              <w:rPr>
+                <w:rFonts w:ascii="Georgia" w:cs="Georgia" w:eastAsia="Georgia" w:hAnsi="Georgia"/>
+                <w:sz w:val="18"/>
+                <w:szCs w:val="18"/>
+              </w:rPr>
+              <w:t xml:space="preserve"/>
+            </w:r>
+          </w:p>
+        </w:tc>
+        <w:tc>
+          <w:tcPr>
+            <w:tcW w:type="dxa" w:w="1300"/>
+          </w:tcPr>
+          <w:p>
+            <w:pPr>
+              <w:jc w:val="center"/>
+            </w:pPr>
+            <w:r>
+              <w:rPr>
+                <w:rFonts w:ascii="Georgia" w:cs="Georgia" w:eastAsia="Georgia" w:hAnsi="Georgia"/>
+                <w:sz w:val="18"/>
+                <w:szCs w:val="18"/>
+              </w:rPr>
+              <w:t xml:space="preserve">polígono</w:t>
+            </w:r>
+          </w:p>
+        </w:tc>
+        <w:tc>
+          <w:tcPr>
+            <w:tcW w:type="dxa" w:w="800"/>
+          </w:tcPr>
+          <w:p>
+            <w:pPr>
+              <w:jc w:val="center"/>
+            </w:pPr>
+            <w:r>
+              <w:rPr>
+                <w:rFonts w:ascii="Georgia" w:cs="Georgia" w:eastAsia="Georgia" w:hAnsi="Georgia"/>
+                <w:sz w:val="18"/>
+                <w:szCs w:val="18"/>
+              </w:rPr>
+              <w:t xml:space="preserve">434</w:t>
+            </w:r>
+          </w:p>
+        </w:tc>
+        <w:tc>
+          <w:tcPr>
+            <w:tcW w:type="dxa" w:w="900"/>
+          </w:tcPr>
+          <w:p>
+            <w:pPr>
+              <w:jc w:val="center"/>
+            </w:pPr>
+            <w:r>
+              <w:rPr>
+                <w:rFonts w:ascii="Georgia" w:cs="Georgia" w:eastAsia="Georgia" w:hAnsi="Georgia"/>
+                <w:sz w:val="18"/>
+                <w:szCs w:val="18"/>
+              </w:rPr>
+              <w:t xml:space="preserve">9,7</w:t>
+            </w:r>
+          </w:p>
+        </w:tc>
+        <w:tc>
+          <w:tcPr>
+            <w:tcW w:type="dxa" w:w="1000"/>
+          </w:tcPr>
+          <w:p>
+            <w:pPr>
+              <w:jc w:val="center"/>
+            </w:pPr>
+            <w:r>
+              <w:rPr>
+                <w:rFonts w:ascii="Georgia" w:cs="Georgia" w:eastAsia="Georgia" w:hAnsi="Georgia"/>
+                <w:sz w:val="18"/>
+                <w:szCs w:val="18"/>
+              </w:rPr>
+              <w:t xml:space="preserve">68,4</w:t>
+            </w:r>
+          </w:p>
+        </w:tc>
+        <w:tc>
+          <w:tcPr>
+            <w:tcW w:type="dxa" w:w="1000"/>
+          </w:tcPr>
+          <w:p>
+            <w:pPr>
+              <w:jc w:val="center"/>
+            </w:pPr>
+            <w:r>
+              <w:rPr>
+                <w:rFonts w:ascii="Georgia" w:cs="Georgia" w:eastAsia="Georgia" w:hAnsi="Georgia"/>
+                <w:sz w:val="18"/>
+                <w:szCs w:val="18"/>
+              </w:rPr>
+              <w:t xml:space="preserve">31</w:t>
+            </w:r>
+          </w:p>
+        </w:tc>
+        <w:tc>
+          <w:tcPr>
+            <w:tcW w:type="dxa" w:w="900"/>
+          </w:tcPr>
+          <w:p>
+            <w:pPr>
+              <w:jc w:val="center"/>
+            </w:pPr>
+            <w:r>
+              <w:rPr>
+                <w:rFonts w:ascii="Georgia" w:cs="Georgia" w:eastAsia="Georgia" w:hAnsi="Georgia"/>
+                <w:sz w:val="18"/>
+                <w:szCs w:val="18"/>
+              </w:rPr>
+              <w:t xml:space="preserve">15</w:t>
+            </w:r>
+          </w:p>
+        </w:tc>
+        <w:tc>
+          <w:tcPr>
+            <w:tcW w:type="dxa" w:w="1000"/>
+          </w:tcPr>
+          <w:p>
+            <w:pPr>
+              <w:jc w:val="center"/>
+            </w:pPr>
+            <w:r>
+              <w:rPr>
+                <w:rFonts w:ascii="Georgia" w:cs="Georgia" w:eastAsia="Georgia" w:hAnsi="Georgia"/>
+                <w:sz w:val="18"/>
+                <w:szCs w:val="18"/>
+              </w:rPr>
+              <w:t xml:space="preserve">22,4</w:t>
+            </w:r>
+          </w:p>
+        </w:tc>
+      </w:tr>
+    </w:tbl>
+    <w:p>
+      <w:pPr>
+        <w:spacing w:after="240"/>
+      </w:pPr>
     </w:p>
     <w:p>
       <w:pPr>
@@ -2402,7 +3535,7 @@
           <w:sz w:val="20"/>
           <w:szCs w:val="20"/>
         </w:rPr>
-        <w:t xml:space="preserve">Lidos em conjunto, os indicadores continuam separando a Urca das duas malhas abertas, mas deixam de agrupar Copacabana e Botafogo tão de perto quanto sugeriria uma leitura não corrigida. A Urca é o caso restrito: 93,3% de seus trechos são de mão única, essa direcionalidade remove 38,3% de suas interseções do núcleo forte, e uma única rota disjunta por porta de acesso liga seu núcleo ao restante da cidade, com uma interseção presente em 52% de suas rotas de tempo mínimo. Copacabana e Botafogo são, ambos, casos abertos no sentido que importa para o acesso: nenhum deles se assemelha ao padrão de porta única da Urca, oferecendo dezoito e dezesseis rotas disjuntas por porta de acesso, respectivamente, e ambos têm uma proporção igualmente alta de trechos de mão única (74,9% e 76,4%). Não são, contudo, gêmeos estruturais: uma vez corrigida a rede de Copacabana para sua fronteira administrativa oficial, suas proporções de pontes fortes e articulações fortes (45,3% e 54,1%) ficam bem abaixo das de Botafogo (70,4% e 63,9%, Tabela 2), ainda que a proporção bruta de mão única praticamente não tenha se alterado. O gargalo de acesso permanece uma propriedade da geografia da Urca, uma península com um único corredor, e não se generaliza para um bairro grande de nenhum dos dois perfis.</w:t>
+        <w:t xml:space="preserve">Lidos em conjunto, os indicadores estruturais (pontes e articulações fortes) não ordenam os casos ao longo de um eixo de gargalo, e a Urca só se isola quando se olha o acesso. A Urca é o caso restrito: 91,3% de seus trechos são de mão única, mas essa direcionalidade retira apenas 7,1% de suas interseções do núcleo forte (contra 38,3% com o retângulo manual, que truncava a península), e uma única rota disjunta liga seu núcleo ao restante da cidade, com as interseções do corredor presentes em 46% a 54% de suas rotas de tempo mínimo. Copacabana e Botafogo são, ambos, casos abertos no sentido que importa para o acesso: nenhum deles se assemelha ao padrão de porta única da Urca, oferecendo dezoito e quinze rotas disjuntas por porta de acesso, respectivamente, e ambos têm uma proporção igualmente alta de trechos de mão única (74,9% e 76,2%). Não são, contudo, gêmeos estruturais: suas proporções de pontes fortes e articulações fortes (45,3% e 54,1% em Copacabana; 68,4% e 63,5% em Botafogo, Tabela 2) diferem bastante, e essa diferença existe com o recorte por polígono e com o retângulo (Seção 4.6). O gargalo de acesso permanece uma propriedade da geografia da Urca, uma península com um único corredor, e não se generaliza para um bairro grande de nenhum dos dois perfis.</w:t>
       </w:r>
     </w:p>
     <w:p>
@@ -2416,7 +3549,7 @@
           <w:sz w:val="20"/>
           <w:szCs w:val="20"/>
         </w:rPr>
-        <w:t xml:space="preserve">O resultado mais contraintuitivo diz respeito a Copacabana. Seu acesso é popularmente associado a poucos túneis, o que a tornava uma candidata plausível a um gargalo estrutural severo. No entanto, nessa resolução, a reputação dos túneis não se traduz em um gargalo mensurável: das vinte e uma portas de acesso encontradas em sua fronteira corrigida, os dois túneis são apenas parte da contagem, e ruas de superfície sustentam o restante de suas dezoito rotas disjuntas por porta de acesso até o restante da cidade. Uma leitura em três degraus, do tipo pequeno, grande e sem gargalo, não é, portanto, sustentada pelos dados; já um contraste em dois grupos, entre restrito e aberto, é.</w:t>
+        <w:t xml:space="preserve">O resultado mais contraintuitivo diz respeito a Copacabana. Seu acesso é popularmente associado a poucos túneis, o que a tornava uma candidata plausível a um gargalo estrutural severo. No entanto, nessa resolução, a reputação dos túneis não se traduz em um gargalo mensurável: das vinte e uma portas de acesso encontradas em sua fronteira oficial, os dois túneis são apenas parte da contagem, e ruas de superfície sustentam o restante de suas dezoito rotas disjuntas por porta de acesso até o restante da cidade. Uma leitura em três degraus, do tipo pequeno, grande e sem gargalo, não é, portanto, sustentada pelos dados; já um contraste em dois grupos, entre restrito e aberto, é.</w:t>
       </w:r>
     </w:p>
     <w:p>
@@ -2430,7 +3563,7 @@
           <w:sz w:val="20"/>
           <w:szCs w:val="20"/>
         </w:rPr>
-        <w:t xml:space="preserve">Diversas ameaças à validade relativizam essas observações. O estudo baseia-se em n = 3 casos contrastantes e é ilustrativo, não estatisticamente geral. Comparar bairros de geografia distinta exige uma extensão espacial que é, ela própria, uma escolha de modelagem, e essa escolha não está isenta de risco: um retângulo delimitador traçado manualmente para Copacabana situava 158 de suas 496 interseções dentro do território oficial de Botafogo (Seção 3.1); todo número referente a Copacabana neste artigo reflete a rede corrigida, e consideramos a discrepância um alerta para qualquer estudo que defina um bairro por um retângulo traçado manualmente perto de uma fronteira compartilhada. Urca e Botafogo não precisaram dessa correção. A definição de porta de acesso depende de uma margem fixa de busca de fronteira, testada de 200 a 800 m ao redor da Urca sem alteração em seu fluxo de acesso, mas ainda não repetida sobre a rede corrigida de Copacabana. A capacidade unitária trata toda rua da mesma forma, ignorando largura e número de faixas; os tempos de percurso apoiam-se em velocidades padrão onde o OpenStreetMap não informa nenhuma; os resultados de conectividade dependem diretamente da qualidade das tags oneway, densas nesses bairros (até 93,3% dos trechos da Urca) e, portanto, consequentes; e o máximo de intermediação da Tabela 3 ainda não foi conferido contra um modelo nulo, de modo que não podemos descartar que parte da diferença entre a Urca e as duas malhas abertas reflita o tamanho do núcleo, e não apenas a geografia (Seção 4.4). A Figura 5 resume os indicadores normalizados, atualizados para a rede corrigida de Copacabana.</w:t>
+        <w:t xml:space="preserve">Diversas ameaças à validade relativizam essas observações. O estudo baseia-se em n = 3 casos contrastantes e é ilustrativo, não estatisticamente geral. Comparar bairros de geografia distinta exige uma extensão espacial que é, ela própria, uma escolha de modelagem, e essa escolha não está isenta de risco: um retângulo traçado manualmente situava 158 das 496 interseções de Copacabana dentro do território oficial de Botafogo e truncava a rede da Urca e a de Botafogo (Seção 3.1). Adotamos a mesma fronteira oficial nos três bairros e mostramos o efeito da alternativa na Seção 4.6; ainda assim, a fronteira administrativa é uma escolha, porque um bairro não é necessariamente uma unidade de mobilidade, e as portas de acesso aqui são as do bairro, não as de uma região funcional. Consideramos a discrepância um alerta para qualquer estudo que defina um bairro por um retângulo traçado manualmente perto de uma fronteira compartilhada. A definição de porta de acesso depende de uma margem fixa de busca de fronteira, testada de 200 a 800 m nos três bairros sem alteração do fluxo de acesso. A capacidade unitária trata toda rua da mesma forma, ignorando largura e número de faixas; os tempos de percurso apoiam-se em velocidades padrão onde o OpenStreetMap não informa nenhuma; os resultados de conectividade dependem diretamente da qualidade das tags oneway, densas nesses bairros (até 91,3% dos trechos da Urca) e, portanto, consequentes; e o máximo de intermediação da Tabela 3 ainda não foi conferido contra um modelo nulo, de modo que não podemos descartar que parte da diferença entre a Urca e as duas malhas abertas reflita o tamanho do núcleo, e não apenas a geografia (Seção 4.4). A Figura 5 resume os indicadores normalizados.</w:t>
       </w:r>
     </w:p>
     <w:p>
@@ -2490,7 +3623,7 @@
           <w:sz w:val="18"/>
           <w:szCs w:val="18"/>
         </w:rPr>
-        <w:t xml:space="preserve">Figura 5 - Indicadores estruturais normalizados por bairro, atualizados para a rede corrigida de Copacabana. As proporções estruturais separam a Urca das duas malhas abertas, mas deixam de equipará-las entre si; o fluxo de acesso da Tabela 3 é o que isola a porta única da Urca.</w:t>
+        <w:t xml:space="preserve">Figura 5 - Indicadores estruturais normalizados por bairro, com as três redes recortadas pelo polígono oficial. As proporções estruturais não ordenam os casos ao longo de um eixo de gargalo; o fluxo de acesso da Tabela 3 é o que isola a porta única da Urca.</w:t>
       </w:r>
     </w:p>
     <w:p>
@@ -2519,7 +3652,7 @@
           <w:sz w:val="20"/>
           <w:szCs w:val="20"/>
         </w:rPr>
-        <w:t xml:space="preserve">Os indicadores estruturais tradicionais, pontes fortes e pontos de articulação fortes, não separam os casos ao longo de um eixo de gargalo: as duas malhas abertas permanecem distantes do regime da Urca, mas, uma vez corrigida a rede de Copacabana para sua fronteira administrativa oficial, as duas malhas abertas deixam de se assemelhar tão de perto quanto sugeriria uma leitura não corrigida. O corte mínimo entre dois nós é pouco informativo aqui, saturando em um porque malhas de mão única densa contêm pontes não dirigidas por quase toda parte. O sinal distintivo vem de um fluxo máximo entre o núcleo de cada bairro e suas portas de acesso administrativas reais: a península se conecta ao restante da cidade por uma única porta de acesso disjunta por ruas, enquanto Copacabana oferece dezoito, e Botafogo, dezesseis. Um desvio forçado ao redor de uma rua fechada também custa mais na Urca (13,6% a mais de tempo de percurso) do que em qualquer uma das malhas abertas (5,1% e 6,0%). O gargalo de acesso é, assim, uma propriedade da geografia da península, e não se generaliza para bairros grandes, nem mesmo para um conhecido pela restrição de acesso por túneis. Essas observações baseiam-se em n = 3 casos contrastantes e são ilustrativas, não estatisticamente gerais; estender a comparação a mais bairros, correlacionar o fluxo de acesso com um índice geométrico de forma, e conferir o máximo de intermediação contra um modelo nulo (Seção 5) ficam para trabalhos futuros.</w:t>
+        <w:t xml:space="preserve">Os indicadores estruturais tradicionais, pontes fortes e pontos de articulação fortes, não separam os casos ao longo de um eixo de gargalo: a Urca fica entre as duas malhas abertas em pontes fortes, e as duas malhas diferem bastante entre si, resultado que se mantém com o recorte por polígono oficial e com o retângulo manual. O corte mínimo entre dois nós é pouco informativo aqui, saturando em um porque malhas de mão única densa contêm pontes não dirigidas por quase toda parte. O sinal distintivo vem de um fluxo máximo entre o núcleo de cada bairro e suas portas de acesso administrativas reais: a península se conecta ao restante da cidade por uma única rota disjunta por ruas, enquanto Copacabana oferece dezoito, e Botafogo, quinze, ordem estável sob variações do recorte, da margem de fronteira e da região de origem. Um desvio forçado ao redor de uma rua fechada também custa mais na Urca (13,6% a mais de tempo de percurso) do que nas malhas abertas (5,1% e 1,8%), embora esse indicador dependa do par origem-destino escolhido. O gargalo de acesso é, assim, uma propriedade da geografia da península, e não se generaliza para bairros grandes, nem mesmo para um conhecido pela restrição de acesso por túneis. Essas observações baseiam-se em n = 3 casos contrastantes e são ilustrativas, não estatisticamente gerais; estender a comparação a mais bairros, correlacionar o fluxo de acesso com um índice geométrico de forma, e conferir o máximo de intermediação contra um modelo nulo (Seção 5) ficam para trabalhos futuros.</w:t>
       </w:r>
     </w:p>
     <w:p>

</xml_diff>